<commit_message>
cleanup and upload to test branch
</commit_message>
<xml_diff>
--- a/publication_study/output/documents/GATHER_checklist.docx
+++ b/publication_study/output/documents/GATHER_checklist.docx
@@ -54,7 +54,7 @@
         </w:rPr>
         <w:t>PROVISIONAL ANALYTICAL DRAFT - NOT FOR SUBMISSION</w:t>
         <w:br/>
-        <w:t>Official GBD 2023 population and official NCI Joinpoint outputs remain external submission gates.</w:t>
+        <w:t>The reconstructed population proxy must be replaced by the matching official GBD 2023 population export. Trend estimates are descriptive analyses of annual GBD posterior means.</w:t>
       </w:r>
     </w:p>
     <w:tbl>
@@ -465,7 +465,7 @@
               <w:rPr>
                 <w:sz w:val="17"/>
               </w:rPr>
-              <w:t>Complete</w:t>
+              <w:t>Partial: burden retrieval date and repository link pending</w:t>
             </w:r>
           </w:p>
         </w:tc>
@@ -562,7 +562,7 @@
               <w:rPr>
                 <w:sz w:val="17"/>
               </w:rPr>
-              <w:t>Complete</w:t>
+              <w:t>Partial until official population is supplied</w:t>
             </w:r>
           </w:p>
         </w:tc>
@@ -756,7 +756,7 @@
               <w:rPr>
                 <w:sz w:val="17"/>
               </w:rPr>
-              <w:t>Complete</w:t>
+              <w:t>Partial: source retrieval metadata incomplete</w:t>
             </w:r>
           </w:p>
         </w:tc>
@@ -853,7 +853,7 @@
               <w:rPr>
                 <w:sz w:val="17"/>
               </w:rPr>
-              <w:t>Complete subject to IHME terms</w:t>
+              <w:t>Partial subject to IHME terms and repository deposit</w:t>
             </w:r>
           </w:p>
         </w:tc>
@@ -1241,7 +1241,7 @@
               <w:rPr>
                 <w:sz w:val="17"/>
               </w:rPr>
-              <w:t>Complete with limitation</w:t>
+              <w:t>Partial: posterior draws unavailable; derived outputs are point estimates</w:t>
             </w:r>
           </w:p>
         </w:tc>
@@ -1629,7 +1629,7 @@
               <w:rPr>
                 <w:sz w:val="17"/>
               </w:rPr>
-              <w:t>Complete for native estimates</w:t>
+              <w:t>Partial: complete for native estimates only</w:t>
             </w:r>
           </w:p>
         </w:tc>
@@ -1929,7 +1929,7 @@
     <w:p/>
     <w:p>
       <w:r>
-        <w:t>Checklist completion does not override the two external submission gates identified in build_metadata.json.</w:t>
+        <w:t>Checklist status does not override the requirement to replace the reconstructed population proxy with the matching official GBD 2023 population export before submission.</w:t>
       </w:r>
     </w:p>
     <w:sectPr>

</xml_diff>